<commit_message>
1/5/26 nhập kho ok
</commit_message>
<xml_diff>
--- a/Ôn tập JS_HTML_Java_reactJS.docx
+++ b/Ôn tập JS_HTML_Java_reactJS.docx
@@ -15,16 +15,16 @@
         <w:jc w:val="both"/>
         <w:rPr>
           <w:rFonts w:hint="default" w:ascii="Times New Roman" w:hAnsi="Times New Roman" w:cs="Times New Roman"/>
-          <w:sz w:val="32"/>
-          <w:szCs w:val="32"/>
-          <w:lang w:val="en-US"/>
-        </w:rPr>
-      </w:pPr>
-      <w:r>
-        <w:rPr>
-          <w:rFonts w:hint="default" w:ascii="Times New Roman" w:hAnsi="Times New Roman" w:cs="Times New Roman"/>
-          <w:sz w:val="32"/>
-          <w:szCs w:val="32"/>
+          <w:sz w:val="24"/>
+          <w:szCs w:val="24"/>
+          <w:lang w:val="en-US"/>
+        </w:rPr>
+      </w:pPr>
+      <w:r>
+        <w:rPr>
+          <w:rFonts w:hint="default" w:ascii="Times New Roman" w:hAnsi="Times New Roman" w:cs="Times New Roman"/>
+          <w:sz w:val="24"/>
+          <w:szCs w:val="24"/>
           <w:lang w:val="en-US"/>
         </w:rPr>
         <w:t xml:space="preserve">Ôn tập JS ES6 - HTML/CSS nâng cao + Java core </w:t>
@@ -43,16 +43,16 @@
         <w:jc w:val="both"/>
         <w:rPr>
           <w:rFonts w:hint="default" w:ascii="Times New Roman" w:hAnsi="Times New Roman" w:cs="Times New Roman"/>
-          <w:sz w:val="28"/>
-          <w:szCs w:val="28"/>
-          <w:lang w:val="en-US"/>
-        </w:rPr>
-      </w:pPr>
-      <w:r>
-        <w:rPr>
-          <w:rFonts w:hint="default" w:ascii="Times New Roman" w:hAnsi="Times New Roman" w:cs="Times New Roman"/>
-          <w:sz w:val="28"/>
-          <w:szCs w:val="28"/>
+          <w:sz w:val="24"/>
+          <w:szCs w:val="24"/>
+          <w:lang w:val="en-US"/>
+        </w:rPr>
+      </w:pPr>
+      <w:r>
+        <w:rPr>
+          <w:rFonts w:hint="default" w:ascii="Times New Roman" w:hAnsi="Times New Roman" w:cs="Times New Roman"/>
+          <w:sz w:val="24"/>
+          <w:szCs w:val="24"/>
           <w:lang w:val="en-US"/>
         </w:rPr>
         <w:t>Ôn tập JS ES6</w:t>
@@ -147,6 +147,8 @@
       <w:pPr>
         <w:rPr>
           <w:rFonts w:hint="default" w:ascii="Times New Roman" w:hAnsi="Times New Roman" w:cs="Times New Roman"/>
+          <w:sz w:val="24"/>
+          <w:szCs w:val="24"/>
           <w:lang w:val="en-US"/>
         </w:rPr>
       </w:pPr>
@@ -448,8 +450,18 @@
           <w:numId w:val="0"/>
         </w:numPr>
         <w:ind w:leftChars="0"/>
-      </w:pPr>
-      <w:r>
+        <w:rPr>
+          <w:rFonts w:hint="default" w:ascii="Times New Roman" w:hAnsi="Times New Roman" w:cs="Times New Roman"/>
+          <w:sz w:val="24"/>
+          <w:szCs w:val="24"/>
+        </w:rPr>
+      </w:pPr>
+      <w:r>
+        <w:rPr>
+          <w:rFonts w:hint="default" w:ascii="Times New Roman" w:hAnsi="Times New Roman" w:cs="Times New Roman"/>
+          <w:sz w:val="24"/>
+          <w:szCs w:val="24"/>
+        </w:rPr>
         <w:drawing>
           <wp:inline distT="0" distB="0" distL="114300" distR="114300">
             <wp:extent cx="5273040" cy="1226185"/>
@@ -501,13 +513,17 @@
         </w:numPr>
         <w:ind w:leftChars="0"/>
         <w:rPr>
-          <w:rFonts w:hint="default"/>
-          <w:lang w:val="en-US"/>
-        </w:rPr>
-      </w:pPr>
-      <w:r>
-        <w:rPr>
-          <w:rFonts w:hint="default"/>
+          <w:rFonts w:hint="default" w:ascii="Times New Roman" w:hAnsi="Times New Roman" w:cs="Times New Roman"/>
+          <w:sz w:val="24"/>
+          <w:szCs w:val="24"/>
+          <w:lang w:val="en-US"/>
+        </w:rPr>
+      </w:pPr>
+      <w:r>
+        <w:rPr>
+          <w:rFonts w:hint="default" w:ascii="Times New Roman" w:hAnsi="Times New Roman" w:cs="Times New Roman"/>
+          <w:sz w:val="24"/>
+          <w:szCs w:val="24"/>
           <w:lang w:val="en-US"/>
         </w:rPr>
         <w:t xml:space="preserve">Có 3 kiểu import </w:t>
@@ -520,8 +536,18 @@
           <w:numId w:val="0"/>
         </w:numPr>
         <w:ind w:leftChars="0"/>
-      </w:pPr>
-      <w:r>
+        <w:rPr>
+          <w:rFonts w:hint="default" w:ascii="Times New Roman" w:hAnsi="Times New Roman" w:cs="Times New Roman"/>
+          <w:sz w:val="24"/>
+          <w:szCs w:val="24"/>
+        </w:rPr>
+      </w:pPr>
+      <w:r>
+        <w:rPr>
+          <w:rFonts w:hint="default" w:ascii="Times New Roman" w:hAnsi="Times New Roman" w:cs="Times New Roman"/>
+          <w:sz w:val="24"/>
+          <w:szCs w:val="24"/>
+        </w:rPr>
         <w:drawing>
           <wp:inline distT="0" distB="0" distL="114300" distR="114300">
             <wp:extent cx="5259705" cy="1723390"/>
@@ -573,7 +599,9 @@
         </w:numPr>
         <w:ind w:leftChars="0"/>
         <w:rPr>
-          <w:rFonts w:hint="default"/>
+          <w:rFonts w:hint="default" w:ascii="Times New Roman" w:hAnsi="Times New Roman" w:cs="Times New Roman"/>
+          <w:sz w:val="24"/>
+          <w:szCs w:val="24"/>
           <w:lang w:val="en-US"/>
         </w:rPr>
       </w:pPr>
@@ -636,8 +664,18 @@
           <w:numId w:val="0"/>
         </w:numPr>
         <w:ind w:leftChars="0"/>
-      </w:pPr>
-      <w:r>
+        <w:rPr>
+          <w:rFonts w:hint="default" w:ascii="Times New Roman" w:hAnsi="Times New Roman" w:cs="Times New Roman"/>
+          <w:sz w:val="24"/>
+          <w:szCs w:val="24"/>
+        </w:rPr>
+      </w:pPr>
+      <w:r>
+        <w:rPr>
+          <w:rFonts w:hint="default" w:ascii="Times New Roman" w:hAnsi="Times New Roman" w:cs="Times New Roman"/>
+          <w:sz w:val="24"/>
+          <w:szCs w:val="24"/>
+        </w:rPr>
         <w:drawing>
           <wp:inline distT="0" distB="0" distL="114300" distR="114300">
             <wp:extent cx="5269230" cy="2388235"/>
@@ -688,6 +726,11 @@
           <w:numId w:val="0"/>
         </w:numPr>
         <w:ind w:leftChars="0"/>
+        <w:rPr>
+          <w:rFonts w:hint="default" w:ascii="Times New Roman" w:hAnsi="Times New Roman" w:cs="Times New Roman"/>
+          <w:sz w:val="24"/>
+          <w:szCs w:val="24"/>
+        </w:rPr>
       </w:pPr>
     </w:p>
     <w:p>
@@ -701,13 +744,17 @@
         </w:tabs>
         <w:ind w:left="420" w:leftChars="0" w:hanging="420" w:firstLineChars="0"/>
         <w:rPr>
-          <w:rFonts w:hint="default"/>
-          <w:lang w:val="en-US"/>
-        </w:rPr>
-      </w:pPr>
-      <w:r>
-        <w:rPr>
-          <w:rFonts w:hint="default"/>
+          <w:rFonts w:hint="default" w:ascii="Times New Roman" w:hAnsi="Times New Roman" w:cs="Times New Roman"/>
+          <w:sz w:val="24"/>
+          <w:szCs w:val="24"/>
+          <w:lang w:val="en-US"/>
+        </w:rPr>
+      </w:pPr>
+      <w:r>
+        <w:rPr>
+          <w:rFonts w:hint="default" w:ascii="Times New Roman" w:hAnsi="Times New Roman" w:cs="Times New Roman"/>
+          <w:sz w:val="24"/>
+          <w:szCs w:val="24"/>
           <w:lang w:val="en-US"/>
         </w:rPr>
         <w:t xml:space="preserve">Lưu ý </w:t>
@@ -720,8 +767,18 @@
           <w:numId w:val="0"/>
         </w:numPr>
         <w:ind w:leftChars="0"/>
-      </w:pPr>
-      <w:r>
+        <w:rPr>
+          <w:rFonts w:hint="default" w:ascii="Times New Roman" w:hAnsi="Times New Roman" w:cs="Times New Roman"/>
+          <w:sz w:val="24"/>
+          <w:szCs w:val="24"/>
+        </w:rPr>
+      </w:pPr>
+      <w:r>
+        <w:rPr>
+          <w:rFonts w:hint="default" w:ascii="Times New Roman" w:hAnsi="Times New Roman" w:cs="Times New Roman"/>
+          <w:sz w:val="24"/>
+          <w:szCs w:val="24"/>
+        </w:rPr>
         <w:drawing>
           <wp:inline distT="0" distB="0" distL="114300" distR="114300">
             <wp:extent cx="5273675" cy="2545715"/>
@@ -773,11 +830,18 @@
         </w:numPr>
         <w:ind w:leftChars="0"/>
         <w:rPr>
-          <w:rFonts w:hint="default"/>
-          <w:lang w:val="en-US"/>
-        </w:rPr>
-      </w:pPr>
-      <w:r>
+          <w:rFonts w:hint="default" w:ascii="Times New Roman" w:hAnsi="Times New Roman" w:cs="Times New Roman"/>
+          <w:sz w:val="24"/>
+          <w:szCs w:val="24"/>
+          <w:lang w:val="en-US"/>
+        </w:rPr>
+      </w:pPr>
+      <w:r>
+        <w:rPr>
+          <w:rFonts w:hint="default" w:ascii="Times New Roman" w:hAnsi="Times New Roman" w:cs="Times New Roman"/>
+          <w:sz w:val="24"/>
+          <w:szCs w:val="24"/>
+        </w:rPr>
         <w:drawing>
           <wp:inline distT="0" distB="0" distL="114300" distR="114300">
             <wp:extent cx="5271770" cy="1210310"/>
@@ -904,8 +968,6 @@
         </w:rPr>
         <w:t xml:space="preserve"> (có thể gọi hàm trước khi khai báo).</w:t>
       </w:r>
-      <w:bookmarkStart w:id="0" w:name="_GoBack"/>
-      <w:bookmarkEnd w:id="0"/>
     </w:p>
     <w:p>
       <w:pPr>
@@ -976,7 +1038,9 @@
     <w:p>
       <w:pPr>
         <w:rPr>
-          <w:rFonts w:hint="default"/>
+          <w:rFonts w:hint="default" w:ascii="Times New Roman" w:hAnsi="Times New Roman" w:cs="Times New Roman"/>
+          <w:sz w:val="24"/>
+          <w:szCs w:val="24"/>
           <w:lang w:val="en-US"/>
         </w:rPr>
       </w:pPr>
@@ -999,6 +1063,11 @@
         <w:t xml:space="preserve"> Gán hàm cho một biến, không có hoisting.</w:t>
       </w:r>
       <w:r>
+        <w:rPr>
+          <w:rFonts w:hint="default" w:ascii="Times New Roman" w:hAnsi="Times New Roman" w:cs="Times New Roman"/>
+          <w:sz w:val="24"/>
+          <w:szCs w:val="24"/>
+        </w:rPr>
         <w:drawing>
           <wp:inline distT="0" distB="0" distL="114300" distR="114300">
             <wp:extent cx="5267325" cy="4286250"/>
@@ -1329,16 +1398,16 @@
         <w:jc w:val="both"/>
         <w:rPr>
           <w:rFonts w:hint="default" w:ascii="Times New Roman" w:hAnsi="Times New Roman" w:cs="Times New Roman"/>
-          <w:sz w:val="28"/>
-          <w:szCs w:val="28"/>
-          <w:lang w:val="en-US"/>
-        </w:rPr>
-      </w:pPr>
-      <w:r>
-        <w:rPr>
-          <w:rFonts w:hint="default" w:ascii="Times New Roman" w:hAnsi="Times New Roman" w:cs="Times New Roman"/>
-          <w:sz w:val="28"/>
-          <w:szCs w:val="28"/>
+          <w:sz w:val="24"/>
+          <w:szCs w:val="24"/>
+          <w:lang w:val="en-US"/>
+        </w:rPr>
+      </w:pPr>
+      <w:r>
+        <w:rPr>
+          <w:rFonts w:hint="default" w:ascii="Times New Roman" w:hAnsi="Times New Roman" w:cs="Times New Roman"/>
+          <w:sz w:val="24"/>
+          <w:szCs w:val="24"/>
           <w:lang w:val="en-US"/>
         </w:rPr>
         <w:t xml:space="preserve">HTML/CSS nâng cao </w:t>
@@ -1617,16 +1686,16 @@
         <w:jc w:val="both"/>
         <w:rPr>
           <w:rFonts w:hint="default" w:ascii="Times New Roman" w:hAnsi="Times New Roman" w:cs="Times New Roman"/>
-          <w:sz w:val="28"/>
-          <w:szCs w:val="28"/>
-          <w:lang w:val="en-US"/>
-        </w:rPr>
-      </w:pPr>
-      <w:r>
-        <w:rPr>
-          <w:rFonts w:hint="default" w:ascii="Times New Roman" w:hAnsi="Times New Roman" w:cs="Times New Roman"/>
-          <w:sz w:val="28"/>
-          <w:szCs w:val="28"/>
+          <w:sz w:val="24"/>
+          <w:szCs w:val="24"/>
+          <w:lang w:val="en-US"/>
+        </w:rPr>
+      </w:pPr>
+      <w:r>
+        <w:rPr>
+          <w:rFonts w:hint="default" w:ascii="Times New Roman" w:hAnsi="Times New Roman" w:cs="Times New Roman"/>
+          <w:sz w:val="24"/>
+          <w:szCs w:val="24"/>
           <w:lang w:val="en-US"/>
         </w:rPr>
         <w:t xml:space="preserve">Java </w:t>
@@ -1659,6 +1728,232 @@
     </w:p>
     <w:p>
       <w:pPr>
+        <w:numPr>
+          <w:ilvl w:val="0"/>
+          <w:numId w:val="0"/>
+        </w:numPr>
+        <w:ind w:leftChars="0"/>
+        <w:rPr>
+          <w:rFonts w:hint="default" w:ascii="Times New Roman" w:hAnsi="Times New Roman" w:cs="Times New Roman"/>
+          <w:sz w:val="24"/>
+          <w:szCs w:val="24"/>
+          <w:lang w:val="en-US"/>
+        </w:rPr>
+      </w:pPr>
+      <w:r>
+        <w:rPr>
+          <w:rFonts w:hint="default" w:ascii="Times New Roman" w:hAnsi="Times New Roman" w:cs="Times New Roman"/>
+          <w:sz w:val="24"/>
+          <w:szCs w:val="24"/>
+          <w:lang w:val="en-US"/>
+        </w:rPr>
+        <w:t xml:space="preserve">JVM ( java virtual machine ) : là máy ảo có nhiệm vụ đọc các file mã trung gian đã được biên dịch ( file .class ) và dịch chúng thành ngôn ngữ máy </w:t>
+      </w:r>
+    </w:p>
+    <w:p>
+      <w:pPr>
+        <w:rPr>
+          <w:rFonts w:hint="default" w:ascii="Times New Roman" w:hAnsi="Times New Roman" w:cs="Times New Roman"/>
+          <w:sz w:val="24"/>
+          <w:szCs w:val="24"/>
+          <w:lang w:val="en-US"/>
+        </w:rPr>
+      </w:pPr>
+    </w:p>
+    <w:p>
+      <w:pPr>
+        <w:numPr>
+          <w:ilvl w:val="0"/>
+          <w:numId w:val="0"/>
+        </w:numPr>
+        <w:ind w:leftChars="0"/>
+        <w:rPr>
+          <w:rFonts w:hint="default" w:ascii="Times New Roman" w:hAnsi="Times New Roman" w:cs="Times New Roman"/>
+          <w:sz w:val="24"/>
+          <w:szCs w:val="24"/>
+          <w:lang w:val="en-US"/>
+        </w:rPr>
+      </w:pPr>
+      <w:r>
+        <w:rPr>
+          <w:rFonts w:hint="default" w:ascii="Times New Roman" w:hAnsi="Times New Roman" w:cs="Times New Roman"/>
+          <w:sz w:val="24"/>
+          <w:szCs w:val="24"/>
+          <w:lang w:val="en-US"/>
+        </w:rPr>
+        <w:t xml:space="preserve">JRE (java runtime environment) : cung cấp môi trường thực thi để các chương trình java có thể chạy trên máy . </w:t>
+      </w:r>
+    </w:p>
+    <w:p>
+      <w:pPr>
+        <w:numPr>
+          <w:ilvl w:val="0"/>
+          <w:numId w:val="0"/>
+        </w:numPr>
+        <w:ind w:leftChars="0"/>
+        <w:rPr>
+          <w:rFonts w:hint="default" w:ascii="Times New Roman" w:hAnsi="Times New Roman" w:cs="Times New Roman"/>
+          <w:sz w:val="24"/>
+          <w:szCs w:val="24"/>
+          <w:lang w:val="en-US"/>
+        </w:rPr>
+      </w:pPr>
+      <w:r>
+        <w:rPr>
+          <w:rFonts w:hint="default" w:ascii="Times New Roman" w:hAnsi="Times New Roman" w:cs="Times New Roman"/>
+          <w:sz w:val="24"/>
+          <w:szCs w:val="24"/>
+          <w:lang w:val="en-US"/>
+        </w:rPr>
+        <w:t xml:space="preserve">                  JRE chứa JVM và các thư viện cốt lõi cùng các file hỗ trợ </w:t>
+      </w:r>
+    </w:p>
+    <w:p>
+      <w:pPr>
+        <w:numPr>
+          <w:ilvl w:val="0"/>
+          <w:numId w:val="0"/>
+        </w:numPr>
+        <w:ind w:leftChars="0"/>
+        <w:rPr>
+          <w:rFonts w:hint="default" w:ascii="Times New Roman" w:hAnsi="Times New Roman" w:cs="Times New Roman"/>
+          <w:sz w:val="24"/>
+          <w:szCs w:val="24"/>
+          <w:lang w:val="en-US"/>
+        </w:rPr>
+      </w:pPr>
+    </w:p>
+    <w:p>
+      <w:pPr>
+        <w:rPr>
+          <w:rFonts w:hint="default" w:ascii="Times New Roman" w:hAnsi="Times New Roman" w:eastAsia="SimSun" w:cs="Times New Roman"/>
+          <w:sz w:val="24"/>
+          <w:szCs w:val="24"/>
+        </w:rPr>
+      </w:pPr>
+      <w:r>
+        <w:rPr>
+          <w:rFonts w:hint="default" w:ascii="Times New Roman" w:hAnsi="Times New Roman" w:cs="Times New Roman"/>
+          <w:sz w:val="24"/>
+          <w:szCs w:val="24"/>
+          <w:lang w:val="en-US"/>
+        </w:rPr>
+        <w:t xml:space="preserve"> JDK (Java develop kit ) - Bộ cung cụ để lập trình : </w:t>
+      </w:r>
+      <w:r>
+        <w:rPr>
+          <w:rFonts w:hint="default" w:ascii="Times New Roman" w:hAnsi="Times New Roman" w:eastAsia="SimSun" w:cs="Times New Roman"/>
+          <w:sz w:val="24"/>
+          <w:szCs w:val="24"/>
+        </w:rPr>
+        <w:t>Cung cấp đầy đủ mọi thứ cần thiết để</w:t>
+      </w:r>
+      <w:r>
+        <w:rPr>
+          <w:rFonts w:hint="default" w:ascii="Times New Roman" w:hAnsi="Times New Roman" w:eastAsia="SimSun" w:cs="Times New Roman"/>
+          <w:b w:val="0"/>
+          <w:bCs w:val="0"/>
+          <w:sz w:val="24"/>
+          <w:szCs w:val="24"/>
+        </w:rPr>
+        <w:t xml:space="preserve"> phát triển</w:t>
+      </w:r>
+      <w:r>
+        <w:rPr>
+          <w:rFonts w:hint="default" w:ascii="Times New Roman" w:hAnsi="Times New Roman" w:eastAsia="SimSun" w:cs="Times New Roman"/>
+          <w:sz w:val="24"/>
+          <w:szCs w:val="24"/>
+        </w:rPr>
+        <w:t xml:space="preserve"> (viết code, biên dịch, gỡ lỗi) và </w:t>
+      </w:r>
+      <w:r>
+        <w:rPr>
+          <w:rFonts w:hint="default" w:ascii="Times New Roman" w:hAnsi="Times New Roman" w:eastAsia="SimSun" w:cs="Times New Roman"/>
+          <w:b/>
+          <w:bCs/>
+          <w:sz w:val="24"/>
+          <w:szCs w:val="24"/>
+        </w:rPr>
+        <w:t>chạy</w:t>
+      </w:r>
+      <w:r>
+        <w:rPr>
+          <w:rFonts w:hint="default" w:ascii="Times New Roman" w:hAnsi="Times New Roman" w:eastAsia="SimSun" w:cs="Times New Roman"/>
+          <w:sz w:val="24"/>
+          <w:szCs w:val="24"/>
+        </w:rPr>
+        <w:t xml:space="preserve"> các ứng dụng Java</w:t>
+      </w:r>
+    </w:p>
+    <w:p>
+      <w:pPr>
+        <w:rPr>
+          <w:rFonts w:hint="default" w:ascii="Times New Roman" w:hAnsi="Times New Roman" w:eastAsia="SimSun" w:cs="Times New Roman"/>
+          <w:sz w:val="24"/>
+          <w:szCs w:val="24"/>
+        </w:rPr>
+      </w:pPr>
+    </w:p>
+    <w:p>
+      <w:pPr>
+        <w:rPr>
+          <w:rFonts w:hint="default" w:ascii="Times New Roman" w:hAnsi="Times New Roman" w:eastAsia="SimSun" w:cs="Times New Roman"/>
+          <w:sz w:val="24"/>
+          <w:szCs w:val="24"/>
+          <w:lang w:val="en-US"/>
+        </w:rPr>
+      </w:pPr>
+      <w:r>
+        <w:rPr>
+          <w:rFonts w:hint="default" w:ascii="Times New Roman" w:hAnsi="Times New Roman" w:cs="Times New Roman"/>
+          <w:sz w:val="24"/>
+          <w:szCs w:val="24"/>
+        </w:rPr>
+        <w:drawing>
+          <wp:inline distT="0" distB="0" distL="114300" distR="114300">
+            <wp:extent cx="5824855" cy="3067050"/>
+            <wp:effectExtent l="0" t="0" r="12065" b="11430"/>
+            <wp:docPr id="8" name="Picture 1"/>
+            <wp:cNvGraphicFramePr>
+              <a:graphicFrameLocks xmlns:a="http://schemas.openxmlformats.org/drawingml/2006/main" noChangeAspect="1"/>
+            </wp:cNvGraphicFramePr>
+            <a:graphic xmlns:a="http://schemas.openxmlformats.org/drawingml/2006/main">
+              <a:graphicData uri="http://schemas.openxmlformats.org/drawingml/2006/picture">
+                <pic:pic xmlns:pic="http://schemas.openxmlformats.org/drawingml/2006/picture">
+                  <pic:nvPicPr>
+                    <pic:cNvPr id="8" name="Picture 1"/>
+                    <pic:cNvPicPr>
+                      <a:picLocks noChangeAspect="1"/>
+                    </pic:cNvPicPr>
+                  </pic:nvPicPr>
+                  <pic:blipFill>
+                    <a:blip r:embed="rId11"/>
+                    <a:stretch>
+                      <a:fillRect/>
+                    </a:stretch>
+                  </pic:blipFill>
+                  <pic:spPr>
+                    <a:xfrm>
+                      <a:off x="0" y="0"/>
+                      <a:ext cx="5824855" cy="3067050"/>
+                    </a:xfrm>
+                    <a:prstGeom prst="rect">
+                      <a:avLst/>
+                    </a:prstGeom>
+                    <a:noFill/>
+                    <a:ln>
+                      <a:noFill/>
+                    </a:ln>
+                  </pic:spPr>
+                </pic:pic>
+              </a:graphicData>
+            </a:graphic>
+          </wp:inline>
+        </w:drawing>
+      </w:r>
+    </w:p>
+    <w:p>
+      <w:pPr>
         <w:pStyle w:val="3"/>
         <w:numPr>
           <w:ilvl w:val="1"/>
@@ -1681,6 +1976,333 @@
         </w:rPr>
         <w:t>OOP trong Java (cực quan trọng)</w:t>
       </w:r>
+    </w:p>
+    <w:p>
+      <w:pPr>
+        <w:pStyle w:val="4"/>
+        <w:numPr>
+          <w:ilvl w:val="0"/>
+          <w:numId w:val="4"/>
+        </w:numPr>
+        <w:bidi w:val="0"/>
+        <w:rPr>
+          <w:rFonts w:hint="default"/>
+          <w:lang w:val="en-US"/>
+        </w:rPr>
+      </w:pPr>
+      <w:r>
+        <w:rPr>
+          <w:rFonts w:hint="default"/>
+          <w:lang w:val="en-US"/>
+        </w:rPr>
+        <w:t xml:space="preserve">Vòng đời của đối tượng </w:t>
+      </w:r>
+    </w:p>
+    <w:p>
+      <w:pPr>
+        <w:pStyle w:val="8"/>
+        <w:keepNext w:val="0"/>
+        <w:keepLines w:val="0"/>
+        <w:widowControl/>
+        <w:suppressLineNumbers w:val="0"/>
+      </w:pPr>
+      <w:r>
+        <w:t>Mọi thứ bắt đầu từ Class và Object, nhưng để tạo ra Object, bạn cần Constructor (Hàm tạo).</w:t>
+      </w:r>
+    </w:p>
+    <w:p>
+      <w:pPr>
+        <w:pStyle w:val="8"/>
+        <w:keepNext w:val="0"/>
+        <w:keepLines w:val="0"/>
+        <w:widowControl/>
+        <w:suppressLineNumbers w:val="0"/>
+        <w:ind w:left="720"/>
+      </w:pPr>
+      <w:r>
+        <w:rPr>
+          <w:b/>
+          <w:bCs/>
+        </w:rPr>
+        <w:t>Constructor:</w:t>
+      </w:r>
+      <w:r>
+        <w:t xml:space="preserve"> Là một hàm đặc biệt có tên </w:t>
+      </w:r>
+      <w:r>
+        <w:rPr>
+          <w:b/>
+          <w:bCs/>
+        </w:rPr>
+        <w:t>giống hệt tên Class</w:t>
+      </w:r>
+      <w:r>
+        <w:t xml:space="preserve"> và </w:t>
+      </w:r>
+      <w:r>
+        <w:rPr>
+          <w:b/>
+          <w:bCs/>
+        </w:rPr>
+        <w:t>không có kiểu trả về</w:t>
+      </w:r>
+      <w:r>
+        <w:t xml:space="preserve"> (kể cả </w:t>
+      </w:r>
+      <w:r>
+        <w:rPr>
+          <w:rStyle w:val="7"/>
+        </w:rPr>
+        <w:t>void</w:t>
+      </w:r>
+      <w:r>
+        <w:t xml:space="preserve">). Nó được tự động gọi khi bạn dùng từ khóa </w:t>
+      </w:r>
+      <w:r>
+        <w:rPr>
+          <w:rStyle w:val="7"/>
+        </w:rPr>
+        <w:t>new</w:t>
+      </w:r>
+      <w:r>
+        <w:t xml:space="preserve"> để tạo đối tượng.</w:t>
+      </w:r>
+    </w:p>
+    <w:p>
+      <w:pPr>
+        <w:pStyle w:val="8"/>
+        <w:keepNext w:val="0"/>
+        <w:keepLines w:val="0"/>
+        <w:widowControl/>
+        <w:suppressLineNumbers w:val="0"/>
+        <w:ind w:left="720"/>
+      </w:pPr>
+      <w:r>
+        <w:rPr>
+          <w:b/>
+          <w:bCs/>
+        </w:rPr>
+        <w:t xml:space="preserve">Từ khóa </w:t>
+      </w:r>
+      <w:r>
+        <w:rPr>
+          <w:rStyle w:val="7"/>
+          <w:b/>
+          <w:bCs/>
+        </w:rPr>
+        <w:t>this</w:t>
+      </w:r>
+      <w:r>
+        <w:rPr>
+          <w:b/>
+          <w:bCs/>
+        </w:rPr>
+        <w:t>:</w:t>
+      </w:r>
+      <w:r>
+        <w:t xml:space="preserve"> Đại diện cho chính đối tượng hiện tại đang gọi đến nó. Dùng để phân biệt giữa thuộc tính của class và tham số truyền vào khi chúng trùng tên.</w:t>
+      </w:r>
+    </w:p>
+    <w:p>
+      <w:pPr>
+        <w:rPr>
+          <w:rFonts w:hint="default"/>
+          <w:lang w:val="en-US"/>
+        </w:rPr>
+      </w:pPr>
+    </w:p>
+    <w:p>
+      <w:pPr>
+        <w:pStyle w:val="4"/>
+        <w:numPr>
+          <w:ilvl w:val="0"/>
+          <w:numId w:val="5"/>
+        </w:numPr>
+        <w:bidi w:val="0"/>
+        <w:rPr>
+          <w:rFonts w:hint="default" w:ascii="Times New Roman" w:hAnsi="Times New Roman" w:cs="Times New Roman"/>
+          <w:sz w:val="24"/>
+          <w:szCs w:val="24"/>
+          <w:lang w:val="en-US"/>
+        </w:rPr>
+      </w:pPr>
+      <w:r>
+        <w:rPr>
+          <w:rFonts w:hint="default" w:ascii="Times New Roman" w:hAnsi="Times New Roman" w:cs="Times New Roman"/>
+          <w:sz w:val="24"/>
+          <w:szCs w:val="24"/>
+          <w:lang w:val="en-US"/>
+        </w:rPr>
+        <w:t xml:space="preserve">Tính đa hình </w:t>
+      </w:r>
+    </w:p>
+    <w:p>
+      <w:pPr>
+        <w:numPr>
+          <w:numId w:val="0"/>
+        </w:numPr>
+        <w:ind w:leftChars="0"/>
+        <w:rPr>
+          <w:rFonts w:hint="default" w:ascii="Times New Roman" w:hAnsi="Times New Roman" w:cs="Times New Roman"/>
+          <w:sz w:val="24"/>
+          <w:szCs w:val="24"/>
+          <w:lang w:val="en-US"/>
+        </w:rPr>
+      </w:pPr>
+      <w:r>
+        <w:rPr>
+          <w:rFonts w:hint="default" w:ascii="Times New Roman" w:hAnsi="Times New Roman" w:cs="Times New Roman"/>
+          <w:sz w:val="24"/>
+          <w:szCs w:val="24"/>
+          <w:lang w:val="en-US"/>
+        </w:rPr>
+        <w:t xml:space="preserve">Nạp chồng phương thức </w:t>
+      </w:r>
+    </w:p>
+    <w:p>
+      <w:pPr>
+        <w:numPr>
+          <w:numId w:val="0"/>
+        </w:numPr>
+        <w:ind w:leftChars="0"/>
+        <w:rPr>
+          <w:rFonts w:hint="default" w:ascii="Times New Roman" w:hAnsi="Times New Roman" w:cs="Times New Roman"/>
+          <w:sz w:val="24"/>
+          <w:szCs w:val="24"/>
+          <w:lang w:val="en-US"/>
+        </w:rPr>
+      </w:pPr>
+      <w:r>
+        <w:rPr>
+          <w:rFonts w:hint="default" w:ascii="Times New Roman" w:hAnsi="Times New Roman" w:cs="Times New Roman"/>
+          <w:sz w:val="24"/>
+          <w:szCs w:val="24"/>
+          <w:lang w:val="en-US"/>
+        </w:rPr>
+        <w:t>Ghi đè phương thức</w:t>
+      </w:r>
+    </w:p>
+    <w:p>
+      <w:pPr>
+        <w:pStyle w:val="4"/>
+        <w:numPr>
+          <w:ilvl w:val="0"/>
+          <w:numId w:val="5"/>
+        </w:numPr>
+        <w:bidi w:val="0"/>
+        <w:rPr>
+          <w:rFonts w:hint="default" w:ascii="Times New Roman" w:hAnsi="Times New Roman" w:cs="Times New Roman"/>
+          <w:sz w:val="24"/>
+          <w:szCs w:val="24"/>
+          <w:lang w:val="en-US"/>
+        </w:rPr>
+      </w:pPr>
+      <w:r>
+        <w:rPr>
+          <w:rFonts w:hint="default" w:ascii="Times New Roman" w:hAnsi="Times New Roman" w:cs="Times New Roman"/>
+          <w:sz w:val="24"/>
+          <w:szCs w:val="24"/>
+          <w:lang w:val="en-US"/>
+        </w:rPr>
+        <w:t xml:space="preserve">Tính kế thừa </w:t>
+      </w:r>
+    </w:p>
+    <w:p>
+      <w:pPr>
+        <w:rPr>
+          <w:rFonts w:hint="default"/>
+          <w:lang w:val="en-US"/>
+        </w:rPr>
+      </w:pPr>
+      <w:r>
+        <w:rPr>
+          <w:rFonts w:hint="default"/>
+          <w:lang w:val="en-US"/>
+        </w:rPr>
+        <w:t>Lớp cha và lớp con</w:t>
+      </w:r>
+    </w:p>
+    <w:p>
+      <w:pPr>
+        <w:pStyle w:val="4"/>
+        <w:numPr>
+          <w:ilvl w:val="0"/>
+          <w:numId w:val="5"/>
+        </w:numPr>
+        <w:bidi w:val="0"/>
+        <w:rPr>
+          <w:rFonts w:hint="default"/>
+          <w:lang w:val="en-US"/>
+        </w:rPr>
+      </w:pPr>
+      <w:r>
+        <w:rPr>
+          <w:rFonts w:hint="default" w:ascii="Times New Roman" w:hAnsi="Times New Roman" w:cs="Times New Roman"/>
+          <w:sz w:val="24"/>
+          <w:szCs w:val="24"/>
+          <w:lang w:val="en-US"/>
+        </w:rPr>
+        <w:t xml:space="preserve">Tính đóng gói </w:t>
+      </w:r>
+    </w:p>
+    <w:p>
+      <w:pPr>
+        <w:rPr>
+          <w:rFonts w:hint="default"/>
+          <w:lang w:val="en-US"/>
+        </w:rPr>
+      </w:pPr>
+      <w:r>
+        <w:rPr>
+          <w:rFonts w:hint="default"/>
+          <w:lang w:val="en-US"/>
+        </w:rPr>
+        <w:t>Public , private , proted , default</w:t>
+      </w:r>
+    </w:p>
+    <w:p>
+      <w:pPr>
+        <w:pStyle w:val="4"/>
+        <w:numPr>
+          <w:ilvl w:val="0"/>
+          <w:numId w:val="5"/>
+        </w:numPr>
+        <w:bidi w:val="0"/>
+        <w:rPr>
+          <w:rFonts w:hint="default" w:ascii="Times New Roman" w:hAnsi="Times New Roman" w:cs="Times New Roman"/>
+          <w:sz w:val="24"/>
+          <w:szCs w:val="24"/>
+          <w:lang w:val="en-US"/>
+        </w:rPr>
+      </w:pPr>
+      <w:r>
+        <w:rPr>
+          <w:rFonts w:hint="default" w:ascii="Times New Roman" w:hAnsi="Times New Roman" w:cs="Times New Roman"/>
+          <w:sz w:val="24"/>
+          <w:szCs w:val="24"/>
+          <w:lang w:val="en-US"/>
+        </w:rPr>
+        <w:t xml:space="preserve">Tính trừu tượng </w:t>
+      </w:r>
+    </w:p>
+    <w:p>
+      <w:pPr>
+        <w:rPr>
+          <w:rFonts w:hint="default"/>
+          <w:lang w:val="en-US"/>
+        </w:rPr>
+      </w:pPr>
+      <w:r>
+        <w:rPr>
+          <w:rFonts w:hint="default" w:ascii="Times New Roman" w:hAnsi="Times New Roman" w:cs="Times New Roman"/>
+          <w:sz w:val="24"/>
+          <w:szCs w:val="24"/>
+          <w:lang w:val="en-US"/>
+        </w:rPr>
+        <w:t xml:space="preserve">Interface , abtracst class </w:t>
+      </w:r>
+      <w:bookmarkStart w:id="0" w:name="_GoBack"/>
+      <w:bookmarkEnd w:id="0"/>
     </w:p>
     <w:p>
       <w:pPr>
@@ -1945,19 +2567,79 @@
         <w:jc w:val="both"/>
         <w:rPr>
           <w:rFonts w:hint="default" w:ascii="Times New Roman" w:hAnsi="Times New Roman" w:cs="Times New Roman"/>
-          <w:sz w:val="32"/>
-          <w:szCs w:val="32"/>
-          <w:lang w:val="en-US"/>
-        </w:rPr>
-      </w:pPr>
-      <w:r>
-        <w:rPr>
-          <w:rFonts w:hint="default" w:ascii="Times New Roman" w:hAnsi="Times New Roman" w:cs="Times New Roman"/>
-          <w:sz w:val="32"/>
-          <w:szCs w:val="32"/>
+          <w:sz w:val="24"/>
+          <w:szCs w:val="24"/>
+          <w:lang w:val="en-US"/>
+        </w:rPr>
+      </w:pPr>
+      <w:r>
+        <w:rPr>
+          <w:rFonts w:hint="default" w:ascii="Times New Roman" w:hAnsi="Times New Roman" w:cs="Times New Roman"/>
+          <w:sz w:val="24"/>
+          <w:szCs w:val="24"/>
           <w:lang w:val="en-US"/>
         </w:rPr>
         <w:t>Java spring boot + ReactJS</w:t>
+      </w:r>
+    </w:p>
+    <w:p>
+      <w:pPr>
+        <w:pStyle w:val="3"/>
+        <w:numPr>
+          <w:ilvl w:val="0"/>
+          <w:numId w:val="6"/>
+        </w:numPr>
+        <w:bidi w:val="0"/>
+        <w:rPr>
+          <w:rFonts w:hint="default" w:ascii="Times New Roman" w:hAnsi="Times New Roman" w:cs="Times New Roman"/>
+          <w:sz w:val="24"/>
+          <w:szCs w:val="24"/>
+          <w:lang w:val="en-US"/>
+        </w:rPr>
+      </w:pPr>
+      <w:r>
+        <w:rPr>
+          <w:rFonts w:hint="default" w:ascii="Times New Roman" w:hAnsi="Times New Roman" w:cs="Times New Roman"/>
+          <w:sz w:val="24"/>
+          <w:szCs w:val="24"/>
+          <w:lang w:val="en-US"/>
+        </w:rPr>
+        <w:t>JAVA spring boot</w:t>
+      </w:r>
+    </w:p>
+    <w:p>
+      <w:pPr>
+        <w:rPr>
+          <w:rFonts w:hint="default" w:ascii="Times New Roman" w:hAnsi="Times New Roman" w:cs="Times New Roman"/>
+          <w:sz w:val="24"/>
+          <w:szCs w:val="24"/>
+          <w:lang w:val="en-US"/>
+        </w:rPr>
+      </w:pPr>
+    </w:p>
+    <w:p>
+      <w:pPr>
+        <w:pStyle w:val="3"/>
+        <w:numPr>
+          <w:ilvl w:val="0"/>
+          <w:numId w:val="6"/>
+        </w:numPr>
+        <w:bidi w:val="0"/>
+        <w:rPr>
+          <w:rFonts w:hint="default" w:ascii="Times New Roman" w:hAnsi="Times New Roman" w:cs="Times New Roman"/>
+          <w:sz w:val="24"/>
+          <w:szCs w:val="24"/>
+          <w:lang w:val="en-US"/>
+        </w:rPr>
+      </w:pPr>
+      <w:r>
+        <w:rPr>
+          <w:rFonts w:hint="default" w:ascii="Times New Roman" w:hAnsi="Times New Roman" w:cs="Times New Roman"/>
+          <w:sz w:val="24"/>
+          <w:szCs w:val="24"/>
+          <w:lang w:val="en-US"/>
+        </w:rPr>
+        <w:t>ReactJS</w:t>
       </w:r>
     </w:p>
     <w:sectPr>
@@ -2123,6 +2805,26 @@
     </w:lvl>
   </w:abstractNum>
   <w:abstractNum w:abstractNumId="2">
+    <w:nsid w:val="0EC4CAD6"/>
+    <w:multiLevelType w:val="singleLevel"/>
+    <w:tmpl w:val="0EC4CAD6"/>
+    <w:lvl w:ilvl="0" w:tentative="0">
+      <w:start w:val="1"/>
+      <w:numFmt w:val="bullet"/>
+      <w:lvlText w:val=""/>
+      <w:lvlJc w:val="left"/>
+      <w:pPr>
+        <w:tabs>
+          <w:tab w:val="left" w:pos="420"/>
+        </w:tabs>
+        <w:ind w:left="420" w:leftChars="0" w:hanging="420" w:firstLineChars="0"/>
+      </w:pPr>
+      <w:rPr>
+        <w:rFonts w:hint="default" w:ascii="Wingdings" w:hAnsi="Wingdings"/>
+      </w:rPr>
+    </w:lvl>
+  </w:abstractNum>
+  <w:abstractNum w:abstractNumId="3">
     <w:nsid w:val="1574654C"/>
     <w:multiLevelType w:val="singleLevel"/>
     <w:tmpl w:val="1574654C"/>
@@ -2142,14 +2844,55 @@
       </w:rPr>
     </w:lvl>
   </w:abstractNum>
+  <w:abstractNum w:abstractNumId="4">
+    <w:nsid w:val="2BA390FB"/>
+    <w:multiLevelType w:val="singleLevel"/>
+    <w:tmpl w:val="2BA390FB"/>
+    <w:lvl w:ilvl="0" w:tentative="0">
+      <w:start w:val="1"/>
+      <w:numFmt w:val="bullet"/>
+      <w:lvlText w:val=""/>
+      <w:lvlJc w:val="left"/>
+      <w:pPr>
+        <w:tabs>
+          <w:tab w:val="left" w:pos="420"/>
+        </w:tabs>
+        <w:ind w:left="420" w:leftChars="0" w:hanging="420" w:firstLineChars="0"/>
+      </w:pPr>
+      <w:rPr>
+        <w:rFonts w:hint="default" w:ascii="Wingdings" w:hAnsi="Wingdings"/>
+      </w:rPr>
+    </w:lvl>
+  </w:abstractNum>
+  <w:abstractNum w:abstractNumId="5">
+    <w:nsid w:val="3F4A740E"/>
+    <w:multiLevelType w:val="singleLevel"/>
+    <w:tmpl w:val="3F4A740E"/>
+    <w:lvl w:ilvl="0" w:tentative="0">
+      <w:start w:val="1"/>
+      <w:numFmt w:val="decimal"/>
+      <w:suff w:val="space"/>
+      <w:lvlText w:val="%1."/>
+      <w:lvlJc w:val="left"/>
+    </w:lvl>
+  </w:abstractNum>
   <w:num w:numId="1">
-    <w:abstractNumId w:val="2"/>
+    <w:abstractNumId w:val="3"/>
   </w:num>
   <w:num w:numId="2">
     <w:abstractNumId w:val="0"/>
   </w:num>
   <w:num w:numId="3">
     <w:abstractNumId w:val="1"/>
+  </w:num>
+  <w:num w:numId="4">
+    <w:abstractNumId w:val="4"/>
+  </w:num>
+  <w:num w:numId="5">
+    <w:abstractNumId w:val="2"/>
+  </w:num>
+  <w:num w:numId="6">
+    <w:abstractNumId w:val="5"/>
   </w:num>
 </w:numbering>
 </file>
@@ -2503,6 +3246,31 @@
       </w:tblCellMar>
     </w:tblPr>
   </w:style>
+  <w:style w:type="character" w:styleId="7">
+    <w:name w:val="HTML Code"/>
+    <w:basedOn w:val="5"/>
+    <w:uiPriority w:val="0"/>
+    <w:rPr>
+      <w:rFonts w:ascii="Courier New" w:hAnsi="Courier New" w:cs="Courier New"/>
+      <w:sz w:val="20"/>
+      <w:szCs w:val="20"/>
+    </w:rPr>
+  </w:style>
+  <w:style w:type="paragraph" w:styleId="8">
+    <w:name w:val="Normal (Web)"/>
+    <w:uiPriority w:val="0"/>
+    <w:pPr>
+      <w:spacing w:before="0" w:beforeAutospacing="1" w:after="0" w:afterAutospacing="1"/>
+      <w:ind w:left="0" w:right="0"/>
+      <w:jc w:val="left"/>
+    </w:pPr>
+    <w:rPr>
+      <w:kern w:val="0"/>
+      <w:sz w:val="24"/>
+      <w:szCs w:val="24"/>
+      <w:lang w:val="en-US" w:eastAsia="zh-CN" w:bidi="ar"/>
+    </w:rPr>
+  </w:style>
 </w:styles>
 </file>
 

</xml_diff>